<commit_message>
The Templated is Updated For Gst and Server.js is updated for the the gst and the for data comes from calculator.
</commit_message>
<xml_diff>
--- a/templates/reliance_industry.docx
+++ b/templates/reliance_industry.docx
@@ -444,8 +444,6 @@
           <w:lang w:eastAsia="en-IN" w:bidi="hi-IN"/>
         </w:rPr>
       </w:pPr>
-      <w:bookmarkStart w:id="0" w:name="_GoBack"/>
-      <w:bookmarkEnd w:id="0"/>
     </w:p>
     <w:p>
       <w:pPr>
@@ -1911,6 +1909,33 @@
         </w:rPr>
         <w:t>Sincerely,</w:t>
       </w:r>
+    </w:p>
+    <w:p>
+      <w:pPr>
+        <w:spacing w:before="100" w:beforeAutospacing="1" w:after="100" w:afterAutospacing="1" w:line="240" w:lineRule="auto"/>
+        <w:rPr>
+          <w:rFonts w:ascii="Charis SIL" w:eastAsia="Times New Roman" w:hAnsi="Charis SIL" w:cs="Charis SIL"/>
+          <w:lang w:eastAsia="en-IN" w:bidi="hi-IN"/>
+        </w:rPr>
+      </w:pPr>
+    </w:p>
+    <w:p>
+      <w:pPr>
+        <w:spacing w:before="100" w:beforeAutospacing="1" w:after="100" w:afterAutospacing="1" w:line="240" w:lineRule="auto"/>
+        <w:rPr>
+          <w:rFonts w:ascii="Charis SIL" w:eastAsia="Times New Roman" w:hAnsi="Charis SIL" w:cs="Charis SIL"/>
+          <w:lang w:eastAsia="en-IN" w:bidi="hi-IN"/>
+        </w:rPr>
+      </w:pPr>
+    </w:p>
+    <w:p>
+      <w:pPr>
+        <w:spacing w:before="100" w:beforeAutospacing="1" w:after="100" w:afterAutospacing="1" w:line="240" w:lineRule="auto"/>
+        <w:rPr>
+          <w:rFonts w:ascii="Charis SIL" w:eastAsia="Times New Roman" w:hAnsi="Charis SIL" w:cs="Charis SIL"/>
+          <w:lang w:eastAsia="en-IN" w:bidi="hi-IN"/>
+        </w:rPr>
+      </w:pPr>
     </w:p>
     <w:p>
       <w:pPr>
@@ -2087,7 +2112,6 @@
               <w:rPr>
                 <w:rFonts w:ascii="Times New Roman" w:eastAsia="Times New Roman" w:hAnsi="Times New Roman" w:cs="Times New Roman"/>
               </w:rPr>
-              <w:lastRenderedPageBreak/>
               <w:t>1</w:t>
             </w:r>
           </w:p>
@@ -2229,7 +2253,13 @@
               <w:rPr>
                 <w:rFonts w:ascii="Times New Roman" w:eastAsia="Times New Roman" w:hAnsi="Times New Roman" w:cs="Times New Roman"/>
               </w:rPr>
-              <w:t>690 Wp HJT NDCR Solar Modules</w:t>
+              <w:t>71</w:t>
+            </w:r>
+            <w:r>
+              <w:rPr>
+                <w:rFonts w:ascii="Times New Roman" w:eastAsia="Times New Roman" w:hAnsi="Times New Roman" w:cs="Times New Roman"/>
+              </w:rPr>
+              <w:t>0 Wp HJT NDCR Solar Modules</w:t>
             </w:r>
           </w:p>
         </w:tc>
@@ -2487,6 +2517,15 @@
                 <w:sz w:val="28"/>
                 <w:szCs w:val="28"/>
               </w:rPr>
+              <w:t>₹</w:t>
+            </w:r>
+            <w:r>
+              <w:rPr>
+                <w:rFonts w:ascii="Times New Roman" w:eastAsia="Times New Roman" w:hAnsi="Times New Roman" w:cs="Times New Roman"/>
+                <w:b/>
+                <w:sz w:val="28"/>
+                <w:szCs w:val="28"/>
+              </w:rPr>
               <w:t>{</w:t>
             </w:r>
             <w:proofErr w:type="spellStart"/>
@@ -2627,7 +2666,7 @@
             </w:pPr>
             <w:r>
               <w:rPr>
-                <w:rFonts w:ascii="Times New Roman" w:eastAsia="Times New Roman" w:hAnsi="Times New Roman" w:cs="Times New Roman"/>
+                <w:rFonts w:ascii="Charis SIL" w:eastAsia="Times New Roman" w:hAnsi="Charis SIL" w:cs="Charis SIL"/>
               </w:rPr>
               <w:t>6</w:t>
             </w:r>
@@ -2648,37 +2687,87 @@
             <w:pPr>
               <w:pStyle w:val="normal1"/>
               <w:widowControl w:val="0"/>
-              <w:spacing w:before="240" w:after="240" w:line="240" w:lineRule="auto"/>
+              <w:spacing w:line="240" w:lineRule="auto"/>
               <w:rPr>
                 <w:rFonts w:ascii="Times New Roman" w:eastAsia="Times New Roman" w:hAnsi="Times New Roman" w:cs="Times New Roman"/>
-                <w:b/>
               </w:rPr>
             </w:pPr>
             <w:r>
               <w:rPr>
                 <w:rFonts w:ascii="Times New Roman" w:eastAsia="Times New Roman" w:hAnsi="Times New Roman" w:cs="Times New Roman"/>
-                <w:b/>
-              </w:rPr>
-              <w:t>Total Amount (₹)</w:t>
+                <w:sz w:val="24"/>
+                <w:szCs w:val="24"/>
+                <w:lang w:val="en-IN" w:eastAsia="en-IN"/>
+              </w:rPr>
+              <w:t>Base Price (Exclusive of GST)</w:t>
             </w:r>
           </w:p>
+        </w:tc>
+        <w:tc>
+          <w:tcPr>
+            <w:tcW w:w="3120" w:type="dxa"/>
+            <w:tcBorders>
+              <w:top w:val="single" w:sz="8" w:space="0" w:color="000000"/>
+              <w:left w:val="single" w:sz="8" w:space="0" w:color="000000"/>
+              <w:bottom w:val="single" w:sz="8" w:space="0" w:color="000000"/>
+              <w:right w:val="single" w:sz="8" w:space="0" w:color="000000"/>
+            </w:tcBorders>
+            <w:shd w:val="clear" w:color="auto" w:fill="auto"/>
+          </w:tcPr>
           <w:p>
             <w:pPr>
-              <w:pStyle w:val="normal1"/>
-              <w:widowControl w:val="0"/>
-              <w:spacing w:before="240" w:after="240" w:line="240" w:lineRule="auto"/>
               <w:rPr>
                 <w:rFonts w:ascii="Times New Roman" w:eastAsia="Times New Roman" w:hAnsi="Times New Roman" w:cs="Times New Roman"/>
-                <w:b/>
+                <w:sz w:val="28"/>
+                <w:szCs w:val="28"/>
+                <w:lang w:val="en-IN" w:eastAsia="en-IN"/>
               </w:rPr>
             </w:pPr>
             <w:r>
               <w:rPr>
-                <w:rFonts w:ascii="Times New Roman" w:eastAsia="Times New Roman" w:hAnsi="Times New Roman" w:cs="Times New Roman"/>
+                <w:rFonts w:ascii="Courier New" w:eastAsia="Times New Roman" w:hAnsi="Courier New" w:cs="Courier New"/>
                 <w:b/>
-                <w:i/>
-              </w:rPr>
-              <w:t>(Exclusive of GST)</w:t>
+                <w:bCs/>
+                <w:sz w:val="28"/>
+                <w:szCs w:val="28"/>
+                <w:lang w:val="en-IN" w:eastAsia="en-IN"/>
+              </w:rPr>
+              <w:t>₹</w:t>
+            </w:r>
+            <w:r>
+              <w:rPr>
+                <w:rFonts w:ascii="Courier New" w:eastAsia="Times New Roman" w:hAnsi="Courier New" w:cs="Courier New"/>
+                <w:b/>
+                <w:bCs/>
+                <w:sz w:val="28"/>
+                <w:szCs w:val="28"/>
+                <w:lang w:val="en-IN" w:eastAsia="en-IN"/>
+              </w:rPr>
+              <w:t>{</w:t>
+            </w:r>
+            <w:proofErr w:type="spellStart"/>
+            <w:r>
+              <w:rPr>
+                <w:rFonts w:ascii="Courier New" w:eastAsia="Times New Roman" w:hAnsi="Courier New" w:cs="Courier New"/>
+                <w:b/>
+                <w:bCs/>
+                <w:sz w:val="28"/>
+                <w:szCs w:val="28"/>
+                <w:lang w:val="en-IN" w:eastAsia="en-IN"/>
+              </w:rPr>
+              <w:t>base_price</w:t>
+            </w:r>
+            <w:proofErr w:type="spellEnd"/>
+            <w:r>
+              <w:rPr>
+                <w:rFonts w:ascii="Courier New" w:eastAsia="Times New Roman" w:hAnsi="Courier New" w:cs="Courier New"/>
+                <w:b/>
+                <w:bCs/>
+                <w:sz w:val="28"/>
+                <w:szCs w:val="28"/>
+                <w:lang w:val="en-IN" w:eastAsia="en-IN"/>
+              </w:rPr>
+              <w:t>}</w:t>
             </w:r>
           </w:p>
           <w:p>
@@ -2688,8 +2777,206 @@
               <w:spacing w:line="240" w:lineRule="auto"/>
               <w:rPr>
                 <w:rFonts w:ascii="Times New Roman" w:eastAsia="Times New Roman" w:hAnsi="Times New Roman" w:cs="Times New Roman"/>
+                <w:b/>
+                <w:sz w:val="28"/>
+                <w:szCs w:val="28"/>
               </w:rPr>
             </w:pPr>
+          </w:p>
+        </w:tc>
+      </w:tr>
+      <w:tr>
+        <w:tc>
+          <w:tcPr>
+            <w:tcW w:w="1798" w:type="dxa"/>
+            <w:tcBorders>
+              <w:top w:val="single" w:sz="8" w:space="0" w:color="000000"/>
+              <w:left w:val="single" w:sz="8" w:space="0" w:color="000000"/>
+              <w:bottom w:val="single" w:sz="8" w:space="0" w:color="000000"/>
+              <w:right w:val="single" w:sz="8" w:space="0" w:color="000000"/>
+            </w:tcBorders>
+            <w:shd w:val="clear" w:color="auto" w:fill="auto"/>
+          </w:tcPr>
+          <w:p>
+            <w:pPr>
+              <w:pStyle w:val="normal1"/>
+              <w:widowControl w:val="0"/>
+              <w:spacing w:line="240" w:lineRule="auto"/>
+              <w:rPr>
+                <w:rFonts w:ascii="Times New Roman" w:eastAsia="Times New Roman" w:hAnsi="Times New Roman" w:cs="Times New Roman"/>
+              </w:rPr>
+            </w:pPr>
+            <w:r>
+              <w:rPr>
+                <w:rFonts w:ascii="Charis SIL" w:eastAsia="Times New Roman" w:hAnsi="Charis SIL" w:cs="Charis SIL"/>
+              </w:rPr>
+              <w:t>7</w:t>
+            </w:r>
+          </w:p>
+        </w:tc>
+        <w:tc>
+          <w:tcPr>
+            <w:tcW w:w="4442" w:type="dxa"/>
+            <w:tcBorders>
+              <w:top w:val="single" w:sz="8" w:space="0" w:color="000000"/>
+              <w:left w:val="single" w:sz="8" w:space="0" w:color="000000"/>
+              <w:bottom w:val="single" w:sz="8" w:space="0" w:color="000000"/>
+              <w:right w:val="single" w:sz="8" w:space="0" w:color="000000"/>
+            </w:tcBorders>
+            <w:shd w:val="clear" w:color="auto" w:fill="auto"/>
+          </w:tcPr>
+          <w:p>
+            <w:pPr>
+              <w:pStyle w:val="normal1"/>
+              <w:widowControl w:val="0"/>
+              <w:spacing w:line="240" w:lineRule="auto"/>
+              <w:rPr>
+                <w:rFonts w:ascii="Times New Roman" w:eastAsia="Times New Roman" w:hAnsi="Times New Roman" w:cs="Times New Roman"/>
+              </w:rPr>
+            </w:pPr>
+            <w:r>
+              <w:rPr>
+                <w:rFonts w:ascii="Times New Roman" w:eastAsia="Times New Roman" w:hAnsi="Times New Roman" w:cs="Times New Roman"/>
+                <w:sz w:val="24"/>
+                <w:szCs w:val="24"/>
+                <w:lang w:val="en-IN" w:eastAsia="en-IN"/>
+              </w:rPr>
+              <w:t>GST @ 13.8%</w:t>
+            </w:r>
+          </w:p>
+        </w:tc>
+        <w:tc>
+          <w:tcPr>
+            <w:tcW w:w="3120" w:type="dxa"/>
+            <w:tcBorders>
+              <w:top w:val="single" w:sz="8" w:space="0" w:color="000000"/>
+              <w:left w:val="single" w:sz="8" w:space="0" w:color="000000"/>
+              <w:bottom w:val="single" w:sz="8" w:space="0" w:color="000000"/>
+              <w:right w:val="single" w:sz="8" w:space="0" w:color="000000"/>
+            </w:tcBorders>
+            <w:shd w:val="clear" w:color="auto" w:fill="auto"/>
+          </w:tcPr>
+          <w:p>
+            <w:pPr>
+              <w:pStyle w:val="normal1"/>
+              <w:widowControl w:val="0"/>
+              <w:spacing w:line="240" w:lineRule="auto"/>
+              <w:rPr>
+                <w:rFonts w:ascii="Times New Roman" w:eastAsia="Times New Roman" w:hAnsi="Times New Roman" w:cs="Times New Roman"/>
+                <w:b/>
+                <w:sz w:val="28"/>
+                <w:szCs w:val="28"/>
+              </w:rPr>
+            </w:pPr>
+            <w:r>
+              <w:rPr>
+                <w:rFonts w:ascii="Courier New" w:eastAsia="Times New Roman" w:hAnsi="Courier New" w:cs="Courier New"/>
+                <w:b/>
+                <w:bCs/>
+                <w:sz w:val="28"/>
+                <w:szCs w:val="28"/>
+                <w:lang w:val="en-IN" w:eastAsia="en-IN"/>
+              </w:rPr>
+              <w:t>₹</w:t>
+            </w:r>
+            <w:r>
+              <w:rPr>
+                <w:rFonts w:ascii="Courier New" w:eastAsia="Times New Roman" w:hAnsi="Courier New" w:cs="Courier New"/>
+                <w:b/>
+                <w:bCs/>
+                <w:sz w:val="28"/>
+                <w:szCs w:val="28"/>
+                <w:lang w:val="en-IN" w:eastAsia="en-IN"/>
+              </w:rPr>
+              <w:t>{</w:t>
+            </w:r>
+            <w:proofErr w:type="spellStart"/>
+            <w:r>
+              <w:rPr>
+                <w:rFonts w:ascii="Courier New" w:eastAsia="Times New Roman" w:hAnsi="Courier New" w:cs="Courier New"/>
+                <w:b/>
+                <w:bCs/>
+                <w:sz w:val="28"/>
+                <w:szCs w:val="28"/>
+                <w:lang w:val="en-IN" w:eastAsia="en-IN"/>
+              </w:rPr>
+              <w:t>gst_amount</w:t>
+            </w:r>
+            <w:proofErr w:type="spellEnd"/>
+            <w:r>
+              <w:rPr>
+                <w:rFonts w:ascii="Courier New" w:eastAsia="Times New Roman" w:hAnsi="Courier New" w:cs="Courier New"/>
+                <w:b/>
+                <w:bCs/>
+                <w:sz w:val="28"/>
+                <w:szCs w:val="28"/>
+                <w:lang w:val="en-IN" w:eastAsia="en-IN"/>
+              </w:rPr>
+              <w:t>}</w:t>
+            </w:r>
+          </w:p>
+        </w:tc>
+      </w:tr>
+      <w:tr>
+        <w:tc>
+          <w:tcPr>
+            <w:tcW w:w="1798" w:type="dxa"/>
+            <w:tcBorders>
+              <w:top w:val="single" w:sz="8" w:space="0" w:color="000000"/>
+              <w:left w:val="single" w:sz="8" w:space="0" w:color="000000"/>
+              <w:bottom w:val="single" w:sz="8" w:space="0" w:color="000000"/>
+              <w:right w:val="single" w:sz="8" w:space="0" w:color="000000"/>
+            </w:tcBorders>
+            <w:shd w:val="clear" w:color="auto" w:fill="auto"/>
+          </w:tcPr>
+          <w:p>
+            <w:pPr>
+              <w:pStyle w:val="normal1"/>
+              <w:widowControl w:val="0"/>
+              <w:spacing w:line="240" w:lineRule="auto"/>
+              <w:rPr>
+                <w:rFonts w:ascii="Times New Roman" w:eastAsia="Times New Roman" w:hAnsi="Times New Roman" w:cs="Times New Roman"/>
+              </w:rPr>
+            </w:pPr>
+            <w:r>
+              <w:rPr>
+                <w:rFonts w:ascii="Charis SIL" w:eastAsia="Times New Roman" w:hAnsi="Charis SIL" w:cs="Charis SIL"/>
+              </w:rPr>
+              <w:t>8</w:t>
+            </w:r>
+          </w:p>
+        </w:tc>
+        <w:tc>
+          <w:tcPr>
+            <w:tcW w:w="4442" w:type="dxa"/>
+            <w:tcBorders>
+              <w:top w:val="single" w:sz="8" w:space="0" w:color="000000"/>
+              <w:left w:val="single" w:sz="8" w:space="0" w:color="000000"/>
+              <w:bottom w:val="single" w:sz="8" w:space="0" w:color="000000"/>
+              <w:right w:val="single" w:sz="8" w:space="0" w:color="000000"/>
+            </w:tcBorders>
+            <w:shd w:val="clear" w:color="auto" w:fill="auto"/>
+          </w:tcPr>
+          <w:p>
+            <w:pPr>
+              <w:pStyle w:val="normal1"/>
+              <w:widowControl w:val="0"/>
+              <w:spacing w:line="240" w:lineRule="auto"/>
+              <w:rPr>
+                <w:rFonts w:ascii="Times New Roman" w:eastAsia="Times New Roman" w:hAnsi="Times New Roman" w:cs="Times New Roman"/>
+              </w:rPr>
+            </w:pPr>
+            <w:r>
+              <w:rPr>
+                <w:rFonts w:ascii="Times New Roman" w:eastAsia="Times New Roman" w:hAnsi="Times New Roman" w:cs="Times New Roman"/>
+                <w:b/>
+                <w:bCs/>
+                <w:sz w:val="24"/>
+                <w:szCs w:val="24"/>
+                <w:lang w:val="en-IN" w:eastAsia="en-IN"/>
+              </w:rPr>
+              <w:t>Total Amount (Inclusive of GST)</w:t>
+            </w:r>
           </w:p>
         </w:tc>
         <w:tc>
@@ -2709,41 +2996,63 @@
               <w:widowControl w:val="0"/>
               <w:spacing w:before="240" w:after="240" w:line="240" w:lineRule="auto"/>
               <w:rPr>
+                <w:rFonts w:ascii="Charis SIL" w:eastAsia="Times New Roman" w:hAnsi="Charis SIL" w:cs="Charis SIL"/>
+                <w:b/>
+                <w:sz w:val="28"/>
+                <w:szCs w:val="28"/>
+              </w:rPr>
+            </w:pPr>
+            <w:r>
+              <w:rPr>
+                <w:rFonts w:ascii="Charis SIL" w:eastAsia="Times New Roman" w:hAnsi="Charis SIL" w:cs="Charis SIL"/>
+                <w:b/>
+                <w:sz w:val="28"/>
+                <w:szCs w:val="28"/>
+              </w:rPr>
+              <w:t>₹</w:t>
+            </w:r>
+            <w:r>
+              <w:rPr>
+                <w:rFonts w:ascii="Charis SIL" w:eastAsia="Times New Roman" w:hAnsi="Charis SIL" w:cs="Charis SIL"/>
+                <w:b/>
+                <w:sz w:val="28"/>
+                <w:szCs w:val="28"/>
+              </w:rPr>
+              <w:t>{</w:t>
+            </w:r>
+            <w:proofErr w:type="spellStart"/>
+            <w:r>
+              <w:rPr>
+                <w:rFonts w:ascii="Charis SIL" w:eastAsia="Times New Roman" w:hAnsi="Charis SIL" w:cs="Charis SIL"/>
+                <w:b/>
+                <w:sz w:val="28"/>
+                <w:szCs w:val="28"/>
+              </w:rPr>
+              <w:t>total_price</w:t>
+            </w:r>
+            <w:proofErr w:type="spellEnd"/>
+            <w:r>
+              <w:rPr>
+                <w:rFonts w:ascii="Charis SIL" w:eastAsia="Times New Roman" w:hAnsi="Charis SIL" w:cs="Charis SIL"/>
+                <w:b/>
+                <w:sz w:val="28"/>
+                <w:szCs w:val="28"/>
+              </w:rPr>
+              <w:t>}</w:t>
+            </w:r>
+          </w:p>
+          <w:p>
+            <w:pPr>
+              <w:pStyle w:val="normal1"/>
+              <w:widowControl w:val="0"/>
+              <w:spacing w:line="240" w:lineRule="auto"/>
+              <w:rPr>
                 <w:rFonts w:ascii="Times New Roman" w:eastAsia="Times New Roman" w:hAnsi="Times New Roman" w:cs="Times New Roman"/>
                 <w:b/>
                 <w:sz w:val="28"/>
                 <w:szCs w:val="28"/>
               </w:rPr>
             </w:pPr>
-            <w:r>
-              <w:rPr>
-                <w:rFonts w:ascii="Times New Roman" w:eastAsia="Times New Roman" w:hAnsi="Times New Roman" w:cs="Times New Roman"/>
-                <w:b/>
-                <w:sz w:val="28"/>
-                <w:szCs w:val="28"/>
-              </w:rPr>
-              <w:t>{</w:t>
-            </w:r>
-            <w:proofErr w:type="spellStart"/>
-            <w:r>
-              <w:rPr>
-                <w:rFonts w:ascii="Times New Roman" w:eastAsia="Times New Roman" w:hAnsi="Times New Roman" w:cs="Times New Roman"/>
-                <w:b/>
-                <w:sz w:val="28"/>
-                <w:szCs w:val="28"/>
-              </w:rPr>
-              <w:t>total_price</w:t>
-            </w:r>
-            <w:proofErr w:type="spellEnd"/>
-            <w:r>
-              <w:rPr>
-                <w:rFonts w:ascii="Times New Roman" w:eastAsia="Times New Roman" w:hAnsi="Times New Roman" w:cs="Times New Roman"/>
-                <w:b/>
-                <w:sz w:val="28"/>
-                <w:szCs w:val="28"/>
-              </w:rPr>
-              <w:t>}</w:t>
-            </w:r>
           </w:p>
         </w:tc>
       </w:tr>
@@ -2756,6 +3065,8 @@
           <w:lang w:eastAsia="en-IN" w:bidi="hi-IN"/>
         </w:rPr>
       </w:pPr>
+      <w:bookmarkStart w:id="0" w:name="_GoBack"/>
+      <w:bookmarkEnd w:id="0"/>
     </w:p>
     <w:p>
       <w:pPr>
@@ -3316,6 +3627,7 @@
           <w:docPartUnique/>
         </w:docPartObj>
       </w:sdtPr>
+      <w:sdtEndPr/>
       <w:sdtContent>
         <w:r>
           <w:rPr>
@@ -5503,7 +5815,7 @@
 </file>
 
 <file path=customXml/itemProps1.xml><?xml version="1.0" encoding="utf-8"?>
-<ds:datastoreItem xmlns:ds="http://schemas.openxmlformats.org/officeDocument/2006/customXml" ds:itemID="{86166080-605F-466E-A7C4-FC6B752466C2}">
+<ds:datastoreItem xmlns:ds="http://schemas.openxmlformats.org/officeDocument/2006/customXml" ds:itemID="{587AB28B-1455-484A-AE60-1A9EB7EF04FA}">
   <ds:schemaRefs>
     <ds:schemaRef ds:uri="http://schemas.openxmlformats.org/officeDocument/2006/bibliography"/>
   </ds:schemaRefs>

</xml_diff>

<commit_message>
The tempaltes of Shakti And Realinace are updated.
</commit_message>
<xml_diff>
--- a/templates/reliance_industry.docx
+++ b/templates/reliance_industry.docx
@@ -514,7 +514,25 @@
           <w:sz w:val="36"/>
           <w:szCs w:val="36"/>
         </w:rPr>
-        <w:t>} Residential HJT Solar System {</w:t>
+        <w:t xml:space="preserve">} </w:t>
+      </w:r>
+      <w:r>
+        <w:rPr>
+          <w:rFonts w:ascii="Times New Roman" w:eastAsia="Times New Roman" w:hAnsi="Times New Roman" w:cs="Times New Roman"/>
+          <w:b/>
+          <w:sz w:val="36"/>
+          <w:szCs w:val="36"/>
+        </w:rPr>
+        <w:t>Commercial HJT</w:t>
+      </w:r>
+      <w:r>
+        <w:rPr>
+          <w:rFonts w:ascii="Times New Roman" w:eastAsia="Times New Roman" w:hAnsi="Times New Roman" w:cs="Times New Roman"/>
+          <w:b/>
+          <w:sz w:val="36"/>
+          <w:szCs w:val="36"/>
+        </w:rPr>
+        <w:t xml:space="preserve"> Solar System {</w:t>
       </w:r>
       <w:proofErr w:type="spellStart"/>
       <w:r>
@@ -2521,30 +2539,399 @@
             </w:r>
             <w:r>
               <w:rPr>
+                <w:rFonts w:ascii="Charis SIL" w:hAnsi="Charis SIL" w:cs="Charis SIL"/>
+                <w:b/>
+                <w:bCs/>
+                <w:color w:val="000000"/>
+                <w:sz w:val="28"/>
+                <w:szCs w:val="28"/>
+                <w:shd w:val="clear" w:color="auto" w:fill="FFFFFF"/>
+              </w:rPr>
+              <w:t>{price_per_kwp}</w:t>
+            </w:r>
+            <w:bookmarkStart w:id="0" w:name="_GoBack"/>
+            <w:bookmarkEnd w:id="0"/>
+          </w:p>
+        </w:tc>
+      </w:tr>
+      <w:tr>
+        <w:tc>
+          <w:tcPr>
+            <w:tcW w:w="1798" w:type="dxa"/>
+            <w:tcBorders>
+              <w:top w:val="single" w:sz="8" w:space="0" w:color="000000"/>
+              <w:left w:val="single" w:sz="8" w:space="0" w:color="000000"/>
+              <w:bottom w:val="single" w:sz="8" w:space="0" w:color="000000"/>
+              <w:right w:val="single" w:sz="8" w:space="0" w:color="000000"/>
+            </w:tcBorders>
+            <w:shd w:val="clear" w:color="auto" w:fill="auto"/>
+          </w:tcPr>
+          <w:p>
+            <w:pPr>
+              <w:pStyle w:val="normal1"/>
+              <w:widowControl w:val="0"/>
+              <w:spacing w:line="240" w:lineRule="auto"/>
+              <w:rPr>
+                <w:rFonts w:ascii="Times New Roman" w:eastAsia="Times New Roman" w:hAnsi="Times New Roman" w:cs="Times New Roman"/>
+              </w:rPr>
+            </w:pPr>
+            <w:r>
+              <w:rPr>
+                <w:rFonts w:ascii="Times New Roman" w:eastAsia="Times New Roman" w:hAnsi="Times New Roman" w:cs="Times New Roman"/>
+              </w:rPr>
+              <w:t>5</w:t>
+            </w:r>
+          </w:p>
+        </w:tc>
+        <w:tc>
+          <w:tcPr>
+            <w:tcW w:w="4442" w:type="dxa"/>
+            <w:tcBorders>
+              <w:top w:val="single" w:sz="8" w:space="0" w:color="000000"/>
+              <w:left w:val="single" w:sz="8" w:space="0" w:color="000000"/>
+              <w:bottom w:val="single" w:sz="8" w:space="0" w:color="000000"/>
+              <w:right w:val="single" w:sz="8" w:space="0" w:color="000000"/>
+            </w:tcBorders>
+            <w:shd w:val="clear" w:color="auto" w:fill="auto"/>
+          </w:tcPr>
+          <w:p>
+            <w:pPr>
+              <w:pStyle w:val="normal1"/>
+              <w:widowControl w:val="0"/>
+              <w:spacing w:line="240" w:lineRule="auto"/>
+              <w:rPr>
+                <w:rFonts w:ascii="Times New Roman" w:eastAsia="Times New Roman" w:hAnsi="Times New Roman" w:cs="Times New Roman"/>
+              </w:rPr>
+            </w:pPr>
+            <w:r>
+              <w:rPr>
+                <w:rFonts w:ascii="Times New Roman" w:eastAsia="Times New Roman" w:hAnsi="Times New Roman" w:cs="Times New Roman"/>
+              </w:rPr>
+              <w:t>Phase</w:t>
+            </w:r>
+          </w:p>
+        </w:tc>
+        <w:tc>
+          <w:tcPr>
+            <w:tcW w:w="3120" w:type="dxa"/>
+            <w:tcBorders>
+              <w:top w:val="single" w:sz="8" w:space="0" w:color="000000"/>
+              <w:left w:val="single" w:sz="8" w:space="0" w:color="000000"/>
+              <w:bottom w:val="single" w:sz="8" w:space="0" w:color="000000"/>
+              <w:right w:val="single" w:sz="8" w:space="0" w:color="000000"/>
+            </w:tcBorders>
+            <w:shd w:val="clear" w:color="auto" w:fill="auto"/>
+          </w:tcPr>
+          <w:p>
+            <w:pPr>
+              <w:pStyle w:val="normal1"/>
+              <w:widowControl w:val="0"/>
+              <w:spacing w:line="240" w:lineRule="auto"/>
+              <w:rPr>
                 <w:rFonts w:ascii="Times New Roman" w:eastAsia="Times New Roman" w:hAnsi="Times New Roman" w:cs="Times New Roman"/>
                 <w:b/>
                 <w:sz w:val="28"/>
                 <w:szCs w:val="28"/>
               </w:rPr>
+            </w:pPr>
+            <w:r>
+              <w:rPr>
+                <w:rFonts w:ascii="Times New Roman" w:eastAsia="Times New Roman" w:hAnsi="Times New Roman" w:cs="Times New Roman"/>
+                <w:b/>
+                <w:sz w:val="28"/>
+                <w:szCs w:val="28"/>
+              </w:rPr>
+              <w:t>{phase}</w:t>
+            </w:r>
+          </w:p>
+        </w:tc>
+      </w:tr>
+      <w:tr>
+        <w:tc>
+          <w:tcPr>
+            <w:tcW w:w="1798" w:type="dxa"/>
+            <w:tcBorders>
+              <w:top w:val="single" w:sz="8" w:space="0" w:color="000000"/>
+              <w:left w:val="single" w:sz="8" w:space="0" w:color="000000"/>
+              <w:bottom w:val="single" w:sz="8" w:space="0" w:color="000000"/>
+              <w:right w:val="single" w:sz="8" w:space="0" w:color="000000"/>
+            </w:tcBorders>
+            <w:shd w:val="clear" w:color="auto" w:fill="auto"/>
+          </w:tcPr>
+          <w:p>
+            <w:pPr>
+              <w:pStyle w:val="normal1"/>
+              <w:widowControl w:val="0"/>
+              <w:spacing w:line="240" w:lineRule="auto"/>
+              <w:rPr>
+                <w:rFonts w:ascii="Times New Roman" w:eastAsia="Times New Roman" w:hAnsi="Times New Roman" w:cs="Times New Roman"/>
+              </w:rPr>
+            </w:pPr>
+            <w:r>
+              <w:rPr>
+                <w:rFonts w:ascii="Charis SIL" w:eastAsia="Times New Roman" w:hAnsi="Charis SIL" w:cs="Charis SIL"/>
+              </w:rPr>
+              <w:t>6</w:t>
+            </w:r>
+          </w:p>
+        </w:tc>
+        <w:tc>
+          <w:tcPr>
+            <w:tcW w:w="4442" w:type="dxa"/>
+            <w:tcBorders>
+              <w:top w:val="single" w:sz="8" w:space="0" w:color="000000"/>
+              <w:left w:val="single" w:sz="8" w:space="0" w:color="000000"/>
+              <w:bottom w:val="single" w:sz="8" w:space="0" w:color="000000"/>
+              <w:right w:val="single" w:sz="8" w:space="0" w:color="000000"/>
+            </w:tcBorders>
+            <w:shd w:val="clear" w:color="auto" w:fill="auto"/>
+          </w:tcPr>
+          <w:p>
+            <w:pPr>
+              <w:pStyle w:val="normal1"/>
+              <w:widowControl w:val="0"/>
+              <w:spacing w:line="240" w:lineRule="auto"/>
+              <w:rPr>
+                <w:rFonts w:ascii="Times New Roman" w:eastAsia="Times New Roman" w:hAnsi="Times New Roman" w:cs="Times New Roman"/>
+              </w:rPr>
+            </w:pPr>
+            <w:r>
+              <w:rPr>
+                <w:rFonts w:ascii="Times New Roman" w:eastAsia="Times New Roman" w:hAnsi="Times New Roman" w:cs="Times New Roman"/>
+                <w:sz w:val="24"/>
+                <w:szCs w:val="24"/>
+                <w:lang w:val="en-IN" w:eastAsia="en-IN"/>
+              </w:rPr>
+              <w:t>Base Price (Exclusive of GST)</w:t>
+            </w:r>
+          </w:p>
+        </w:tc>
+        <w:tc>
+          <w:tcPr>
+            <w:tcW w:w="3120" w:type="dxa"/>
+            <w:tcBorders>
+              <w:top w:val="single" w:sz="8" w:space="0" w:color="000000"/>
+              <w:left w:val="single" w:sz="8" w:space="0" w:color="000000"/>
+              <w:bottom w:val="single" w:sz="8" w:space="0" w:color="000000"/>
+              <w:right w:val="single" w:sz="8" w:space="0" w:color="000000"/>
+            </w:tcBorders>
+            <w:shd w:val="clear" w:color="auto" w:fill="auto"/>
+          </w:tcPr>
+          <w:p>
+            <w:pPr>
+              <w:rPr>
+                <w:rFonts w:ascii="Times New Roman" w:eastAsia="Times New Roman" w:hAnsi="Times New Roman" w:cs="Times New Roman"/>
+                <w:sz w:val="28"/>
+                <w:szCs w:val="28"/>
+                <w:lang w:val="en-IN" w:eastAsia="en-IN"/>
+              </w:rPr>
+            </w:pPr>
+            <w:r>
+              <w:rPr>
+                <w:rFonts w:ascii="Courier New" w:eastAsia="Times New Roman" w:hAnsi="Courier New" w:cs="Courier New"/>
+                <w:b/>
+                <w:bCs/>
+                <w:sz w:val="28"/>
+                <w:szCs w:val="28"/>
+                <w:lang w:val="en-IN" w:eastAsia="en-IN"/>
+              </w:rPr>
+              <w:t>₹</w:t>
+            </w:r>
+            <w:r>
+              <w:rPr>
+                <w:rFonts w:ascii="Courier New" w:eastAsia="Times New Roman" w:hAnsi="Courier New" w:cs="Courier New"/>
+                <w:b/>
+                <w:bCs/>
+                <w:sz w:val="28"/>
+                <w:szCs w:val="28"/>
+                <w:lang w:val="en-IN" w:eastAsia="en-IN"/>
+              </w:rPr>
               <w:t>{</w:t>
             </w:r>
             <w:proofErr w:type="spellStart"/>
             <w:r>
               <w:rPr>
+                <w:rFonts w:ascii="Courier New" w:eastAsia="Times New Roman" w:hAnsi="Courier New" w:cs="Courier New"/>
+                <w:b/>
+                <w:bCs/>
+                <w:sz w:val="28"/>
+                <w:szCs w:val="28"/>
+                <w:lang w:val="en-IN" w:eastAsia="en-IN"/>
+              </w:rPr>
+              <w:t>base_price</w:t>
+            </w:r>
+            <w:proofErr w:type="spellEnd"/>
+            <w:r>
+              <w:rPr>
+                <w:rFonts w:ascii="Courier New" w:eastAsia="Times New Roman" w:hAnsi="Courier New" w:cs="Courier New"/>
+                <w:b/>
+                <w:bCs/>
+                <w:sz w:val="28"/>
+                <w:szCs w:val="28"/>
+                <w:lang w:val="en-IN" w:eastAsia="en-IN"/>
+              </w:rPr>
+              <w:t>}</w:t>
+            </w:r>
+          </w:p>
+          <w:p>
+            <w:pPr>
+              <w:pStyle w:val="normal1"/>
+              <w:widowControl w:val="0"/>
+              <w:spacing w:line="240" w:lineRule="auto"/>
+              <w:rPr>
                 <w:rFonts w:ascii="Times New Roman" w:eastAsia="Times New Roman" w:hAnsi="Times New Roman" w:cs="Times New Roman"/>
                 <w:b/>
                 <w:sz w:val="28"/>
                 <w:szCs w:val="28"/>
               </w:rPr>
-              <w:t>price_per_watt</w:t>
+            </w:pPr>
+          </w:p>
+        </w:tc>
+      </w:tr>
+      <w:tr>
+        <w:tc>
+          <w:tcPr>
+            <w:tcW w:w="1798" w:type="dxa"/>
+            <w:tcBorders>
+              <w:top w:val="single" w:sz="8" w:space="0" w:color="000000"/>
+              <w:left w:val="single" w:sz="8" w:space="0" w:color="000000"/>
+              <w:bottom w:val="single" w:sz="8" w:space="0" w:color="000000"/>
+              <w:right w:val="single" w:sz="8" w:space="0" w:color="000000"/>
+            </w:tcBorders>
+            <w:shd w:val="clear" w:color="auto" w:fill="auto"/>
+          </w:tcPr>
+          <w:p>
+            <w:pPr>
+              <w:pStyle w:val="normal1"/>
+              <w:widowControl w:val="0"/>
+              <w:spacing w:line="240" w:lineRule="auto"/>
+              <w:rPr>
+                <w:rFonts w:ascii="Times New Roman" w:eastAsia="Times New Roman" w:hAnsi="Times New Roman" w:cs="Times New Roman"/>
+              </w:rPr>
+            </w:pPr>
+            <w:r>
+              <w:rPr>
+                <w:rFonts w:ascii="Charis SIL" w:eastAsia="Times New Roman" w:hAnsi="Charis SIL" w:cs="Charis SIL"/>
+              </w:rPr>
+              <w:t>7</w:t>
             </w:r>
-            <w:proofErr w:type="spellEnd"/>
+          </w:p>
+        </w:tc>
+        <w:tc>
+          <w:tcPr>
+            <w:tcW w:w="4442" w:type="dxa"/>
+            <w:tcBorders>
+              <w:top w:val="single" w:sz="8" w:space="0" w:color="000000"/>
+              <w:left w:val="single" w:sz="8" w:space="0" w:color="000000"/>
+              <w:bottom w:val="single" w:sz="8" w:space="0" w:color="000000"/>
+              <w:right w:val="single" w:sz="8" w:space="0" w:color="000000"/>
+            </w:tcBorders>
+            <w:shd w:val="clear" w:color="auto" w:fill="auto"/>
+          </w:tcPr>
+          <w:p>
+            <w:pPr>
+              <w:pStyle w:val="normal1"/>
+              <w:widowControl w:val="0"/>
+              <w:spacing w:line="240" w:lineRule="auto"/>
+              <w:rPr>
+                <w:rFonts w:ascii="Times New Roman" w:eastAsia="Times New Roman" w:hAnsi="Times New Roman" w:cs="Times New Roman"/>
+              </w:rPr>
+            </w:pPr>
             <w:r>
+              <w:rPr>
+                <w:rFonts w:ascii="Times New Roman" w:eastAsia="Times New Roman" w:hAnsi="Times New Roman" w:cs="Times New Roman"/>
+                <w:sz w:val="24"/>
+                <w:szCs w:val="24"/>
+                <w:lang w:val="en-IN" w:eastAsia="en-IN"/>
+              </w:rPr>
+              <w:t xml:space="preserve">GST @ </w:t>
+            </w:r>
+            <w:r>
+              <w:rPr>
+                <w:rFonts w:ascii="Times New Roman" w:eastAsia="Times New Roman" w:hAnsi="Times New Roman" w:cs="Times New Roman"/>
+                <w:sz w:val="24"/>
+                <w:szCs w:val="24"/>
+                <w:lang w:val="en-IN" w:eastAsia="en-IN"/>
+              </w:rPr>
+              <w:t>8.9</w:t>
+            </w:r>
+            <w:r>
+              <w:rPr>
+                <w:rFonts w:ascii="Times New Roman" w:eastAsia="Times New Roman" w:hAnsi="Times New Roman" w:cs="Times New Roman"/>
+                <w:sz w:val="24"/>
+                <w:szCs w:val="24"/>
+                <w:lang w:val="en-IN" w:eastAsia="en-IN"/>
+              </w:rPr>
+              <w:t>%</w:t>
+            </w:r>
+          </w:p>
+        </w:tc>
+        <w:tc>
+          <w:tcPr>
+            <w:tcW w:w="3120" w:type="dxa"/>
+            <w:tcBorders>
+              <w:top w:val="single" w:sz="8" w:space="0" w:color="000000"/>
+              <w:left w:val="single" w:sz="8" w:space="0" w:color="000000"/>
+              <w:bottom w:val="single" w:sz="8" w:space="0" w:color="000000"/>
+              <w:right w:val="single" w:sz="8" w:space="0" w:color="000000"/>
+            </w:tcBorders>
+            <w:shd w:val="clear" w:color="auto" w:fill="auto"/>
+          </w:tcPr>
+          <w:p>
+            <w:pPr>
+              <w:pStyle w:val="normal1"/>
+              <w:widowControl w:val="0"/>
+              <w:spacing w:line="240" w:lineRule="auto"/>
               <w:rPr>
                 <w:rFonts w:ascii="Times New Roman" w:eastAsia="Times New Roman" w:hAnsi="Times New Roman" w:cs="Times New Roman"/>
                 <w:b/>
                 <w:sz w:val="28"/>
                 <w:szCs w:val="28"/>
+              </w:rPr>
+            </w:pPr>
+            <w:r>
+              <w:rPr>
+                <w:rFonts w:ascii="Courier New" w:eastAsia="Times New Roman" w:hAnsi="Courier New" w:cs="Courier New"/>
+                <w:b/>
+                <w:bCs/>
+                <w:sz w:val="28"/>
+                <w:szCs w:val="28"/>
+                <w:lang w:val="en-IN" w:eastAsia="en-IN"/>
+              </w:rPr>
+              <w:t>₹</w:t>
+            </w:r>
+            <w:r>
+              <w:rPr>
+                <w:rFonts w:ascii="Courier New" w:eastAsia="Times New Roman" w:hAnsi="Courier New" w:cs="Courier New"/>
+                <w:b/>
+                <w:bCs/>
+                <w:sz w:val="28"/>
+                <w:szCs w:val="28"/>
+                <w:lang w:val="en-IN" w:eastAsia="en-IN"/>
+              </w:rPr>
+              <w:t>{</w:t>
+            </w:r>
+            <w:proofErr w:type="spellStart"/>
+            <w:r>
+              <w:rPr>
+                <w:rFonts w:ascii="Courier New" w:eastAsia="Times New Roman" w:hAnsi="Courier New" w:cs="Courier New"/>
+                <w:b/>
+                <w:bCs/>
+                <w:sz w:val="28"/>
+                <w:szCs w:val="28"/>
+                <w:lang w:val="en-IN" w:eastAsia="en-IN"/>
+              </w:rPr>
+              <w:t>gst_amount</w:t>
+            </w:r>
+            <w:proofErr w:type="spellEnd"/>
+            <w:r>
+              <w:rPr>
+                <w:rFonts w:ascii="Courier New" w:eastAsia="Times New Roman" w:hAnsi="Courier New" w:cs="Courier New"/>
+                <w:b/>
+                <w:bCs/>
+                <w:sz w:val="28"/>
+                <w:szCs w:val="28"/>
+                <w:lang w:val="en-IN" w:eastAsia="en-IN"/>
               </w:rPr>
               <w:t>}</w:t>
             </w:r>
@@ -2574,372 +2961,6 @@
             </w:pPr>
             <w:r>
               <w:rPr>
-                <w:rFonts w:ascii="Times New Roman" w:eastAsia="Times New Roman" w:hAnsi="Times New Roman" w:cs="Times New Roman"/>
-              </w:rPr>
-              <w:t>5</w:t>
-            </w:r>
-          </w:p>
-        </w:tc>
-        <w:tc>
-          <w:tcPr>
-            <w:tcW w:w="4442" w:type="dxa"/>
-            <w:tcBorders>
-              <w:top w:val="single" w:sz="8" w:space="0" w:color="000000"/>
-              <w:left w:val="single" w:sz="8" w:space="0" w:color="000000"/>
-              <w:bottom w:val="single" w:sz="8" w:space="0" w:color="000000"/>
-              <w:right w:val="single" w:sz="8" w:space="0" w:color="000000"/>
-            </w:tcBorders>
-            <w:shd w:val="clear" w:color="auto" w:fill="auto"/>
-          </w:tcPr>
-          <w:p>
-            <w:pPr>
-              <w:pStyle w:val="normal1"/>
-              <w:widowControl w:val="0"/>
-              <w:spacing w:line="240" w:lineRule="auto"/>
-              <w:rPr>
-                <w:rFonts w:ascii="Times New Roman" w:eastAsia="Times New Roman" w:hAnsi="Times New Roman" w:cs="Times New Roman"/>
-              </w:rPr>
-            </w:pPr>
-            <w:r>
-              <w:rPr>
-                <w:rFonts w:ascii="Times New Roman" w:eastAsia="Times New Roman" w:hAnsi="Times New Roman" w:cs="Times New Roman"/>
-              </w:rPr>
-              <w:t>Phase</w:t>
-            </w:r>
-          </w:p>
-        </w:tc>
-        <w:tc>
-          <w:tcPr>
-            <w:tcW w:w="3120" w:type="dxa"/>
-            <w:tcBorders>
-              <w:top w:val="single" w:sz="8" w:space="0" w:color="000000"/>
-              <w:left w:val="single" w:sz="8" w:space="0" w:color="000000"/>
-              <w:bottom w:val="single" w:sz="8" w:space="0" w:color="000000"/>
-              <w:right w:val="single" w:sz="8" w:space="0" w:color="000000"/>
-            </w:tcBorders>
-            <w:shd w:val="clear" w:color="auto" w:fill="auto"/>
-          </w:tcPr>
-          <w:p>
-            <w:pPr>
-              <w:pStyle w:val="normal1"/>
-              <w:widowControl w:val="0"/>
-              <w:spacing w:line="240" w:lineRule="auto"/>
-              <w:rPr>
-                <w:rFonts w:ascii="Times New Roman" w:eastAsia="Times New Roman" w:hAnsi="Times New Roman" w:cs="Times New Roman"/>
-                <w:b/>
-                <w:sz w:val="28"/>
-                <w:szCs w:val="28"/>
-              </w:rPr>
-            </w:pPr>
-            <w:r>
-              <w:rPr>
-                <w:rFonts w:ascii="Times New Roman" w:eastAsia="Times New Roman" w:hAnsi="Times New Roman" w:cs="Times New Roman"/>
-                <w:b/>
-                <w:sz w:val="28"/>
-                <w:szCs w:val="28"/>
-              </w:rPr>
-              <w:t>{phase}</w:t>
-            </w:r>
-          </w:p>
-        </w:tc>
-      </w:tr>
-      <w:tr>
-        <w:tc>
-          <w:tcPr>
-            <w:tcW w:w="1798" w:type="dxa"/>
-            <w:tcBorders>
-              <w:top w:val="single" w:sz="8" w:space="0" w:color="000000"/>
-              <w:left w:val="single" w:sz="8" w:space="0" w:color="000000"/>
-              <w:bottom w:val="single" w:sz="8" w:space="0" w:color="000000"/>
-              <w:right w:val="single" w:sz="8" w:space="0" w:color="000000"/>
-            </w:tcBorders>
-            <w:shd w:val="clear" w:color="auto" w:fill="auto"/>
-          </w:tcPr>
-          <w:p>
-            <w:pPr>
-              <w:pStyle w:val="normal1"/>
-              <w:widowControl w:val="0"/>
-              <w:spacing w:line="240" w:lineRule="auto"/>
-              <w:rPr>
-                <w:rFonts w:ascii="Times New Roman" w:eastAsia="Times New Roman" w:hAnsi="Times New Roman" w:cs="Times New Roman"/>
-              </w:rPr>
-            </w:pPr>
-            <w:r>
-              <w:rPr>
-                <w:rFonts w:ascii="Charis SIL" w:eastAsia="Times New Roman" w:hAnsi="Charis SIL" w:cs="Charis SIL"/>
-              </w:rPr>
-              <w:t>6</w:t>
-            </w:r>
-          </w:p>
-        </w:tc>
-        <w:tc>
-          <w:tcPr>
-            <w:tcW w:w="4442" w:type="dxa"/>
-            <w:tcBorders>
-              <w:top w:val="single" w:sz="8" w:space="0" w:color="000000"/>
-              <w:left w:val="single" w:sz="8" w:space="0" w:color="000000"/>
-              <w:bottom w:val="single" w:sz="8" w:space="0" w:color="000000"/>
-              <w:right w:val="single" w:sz="8" w:space="0" w:color="000000"/>
-            </w:tcBorders>
-            <w:shd w:val="clear" w:color="auto" w:fill="auto"/>
-          </w:tcPr>
-          <w:p>
-            <w:pPr>
-              <w:pStyle w:val="normal1"/>
-              <w:widowControl w:val="0"/>
-              <w:spacing w:line="240" w:lineRule="auto"/>
-              <w:rPr>
-                <w:rFonts w:ascii="Times New Roman" w:eastAsia="Times New Roman" w:hAnsi="Times New Roman" w:cs="Times New Roman"/>
-              </w:rPr>
-            </w:pPr>
-            <w:r>
-              <w:rPr>
-                <w:rFonts w:ascii="Times New Roman" w:eastAsia="Times New Roman" w:hAnsi="Times New Roman" w:cs="Times New Roman"/>
-                <w:sz w:val="24"/>
-                <w:szCs w:val="24"/>
-                <w:lang w:val="en-IN" w:eastAsia="en-IN"/>
-              </w:rPr>
-              <w:t>Base Price (Exclusive of GST)</w:t>
-            </w:r>
-          </w:p>
-        </w:tc>
-        <w:tc>
-          <w:tcPr>
-            <w:tcW w:w="3120" w:type="dxa"/>
-            <w:tcBorders>
-              <w:top w:val="single" w:sz="8" w:space="0" w:color="000000"/>
-              <w:left w:val="single" w:sz="8" w:space="0" w:color="000000"/>
-              <w:bottom w:val="single" w:sz="8" w:space="0" w:color="000000"/>
-              <w:right w:val="single" w:sz="8" w:space="0" w:color="000000"/>
-            </w:tcBorders>
-            <w:shd w:val="clear" w:color="auto" w:fill="auto"/>
-          </w:tcPr>
-          <w:p>
-            <w:pPr>
-              <w:rPr>
-                <w:rFonts w:ascii="Times New Roman" w:eastAsia="Times New Roman" w:hAnsi="Times New Roman" w:cs="Times New Roman"/>
-                <w:sz w:val="28"/>
-                <w:szCs w:val="28"/>
-                <w:lang w:val="en-IN" w:eastAsia="en-IN"/>
-              </w:rPr>
-            </w:pPr>
-            <w:r>
-              <w:rPr>
-                <w:rFonts w:ascii="Courier New" w:eastAsia="Times New Roman" w:hAnsi="Courier New" w:cs="Courier New"/>
-                <w:b/>
-                <w:bCs/>
-                <w:sz w:val="28"/>
-                <w:szCs w:val="28"/>
-                <w:lang w:val="en-IN" w:eastAsia="en-IN"/>
-              </w:rPr>
-              <w:t>₹</w:t>
-            </w:r>
-            <w:r>
-              <w:rPr>
-                <w:rFonts w:ascii="Courier New" w:eastAsia="Times New Roman" w:hAnsi="Courier New" w:cs="Courier New"/>
-                <w:b/>
-                <w:bCs/>
-                <w:sz w:val="28"/>
-                <w:szCs w:val="28"/>
-                <w:lang w:val="en-IN" w:eastAsia="en-IN"/>
-              </w:rPr>
-              <w:t>{</w:t>
-            </w:r>
-            <w:proofErr w:type="spellStart"/>
-            <w:r>
-              <w:rPr>
-                <w:rFonts w:ascii="Courier New" w:eastAsia="Times New Roman" w:hAnsi="Courier New" w:cs="Courier New"/>
-                <w:b/>
-                <w:bCs/>
-                <w:sz w:val="28"/>
-                <w:szCs w:val="28"/>
-                <w:lang w:val="en-IN" w:eastAsia="en-IN"/>
-              </w:rPr>
-              <w:t>base_price</w:t>
-            </w:r>
-            <w:proofErr w:type="spellEnd"/>
-            <w:r>
-              <w:rPr>
-                <w:rFonts w:ascii="Courier New" w:eastAsia="Times New Roman" w:hAnsi="Courier New" w:cs="Courier New"/>
-                <w:b/>
-                <w:bCs/>
-                <w:sz w:val="28"/>
-                <w:szCs w:val="28"/>
-                <w:lang w:val="en-IN" w:eastAsia="en-IN"/>
-              </w:rPr>
-              <w:t>}</w:t>
-            </w:r>
-          </w:p>
-          <w:p>
-            <w:pPr>
-              <w:pStyle w:val="normal1"/>
-              <w:widowControl w:val="0"/>
-              <w:spacing w:line="240" w:lineRule="auto"/>
-              <w:rPr>
-                <w:rFonts w:ascii="Times New Roman" w:eastAsia="Times New Roman" w:hAnsi="Times New Roman" w:cs="Times New Roman"/>
-                <w:b/>
-                <w:sz w:val="28"/>
-                <w:szCs w:val="28"/>
-              </w:rPr>
-            </w:pPr>
-          </w:p>
-        </w:tc>
-      </w:tr>
-      <w:tr>
-        <w:tc>
-          <w:tcPr>
-            <w:tcW w:w="1798" w:type="dxa"/>
-            <w:tcBorders>
-              <w:top w:val="single" w:sz="8" w:space="0" w:color="000000"/>
-              <w:left w:val="single" w:sz="8" w:space="0" w:color="000000"/>
-              <w:bottom w:val="single" w:sz="8" w:space="0" w:color="000000"/>
-              <w:right w:val="single" w:sz="8" w:space="0" w:color="000000"/>
-            </w:tcBorders>
-            <w:shd w:val="clear" w:color="auto" w:fill="auto"/>
-          </w:tcPr>
-          <w:p>
-            <w:pPr>
-              <w:pStyle w:val="normal1"/>
-              <w:widowControl w:val="0"/>
-              <w:spacing w:line="240" w:lineRule="auto"/>
-              <w:rPr>
-                <w:rFonts w:ascii="Times New Roman" w:eastAsia="Times New Roman" w:hAnsi="Times New Roman" w:cs="Times New Roman"/>
-              </w:rPr>
-            </w:pPr>
-            <w:r>
-              <w:rPr>
-                <w:rFonts w:ascii="Charis SIL" w:eastAsia="Times New Roman" w:hAnsi="Charis SIL" w:cs="Charis SIL"/>
-              </w:rPr>
-              <w:t>7</w:t>
-            </w:r>
-          </w:p>
-        </w:tc>
-        <w:tc>
-          <w:tcPr>
-            <w:tcW w:w="4442" w:type="dxa"/>
-            <w:tcBorders>
-              <w:top w:val="single" w:sz="8" w:space="0" w:color="000000"/>
-              <w:left w:val="single" w:sz="8" w:space="0" w:color="000000"/>
-              <w:bottom w:val="single" w:sz="8" w:space="0" w:color="000000"/>
-              <w:right w:val="single" w:sz="8" w:space="0" w:color="000000"/>
-            </w:tcBorders>
-            <w:shd w:val="clear" w:color="auto" w:fill="auto"/>
-          </w:tcPr>
-          <w:p>
-            <w:pPr>
-              <w:pStyle w:val="normal1"/>
-              <w:widowControl w:val="0"/>
-              <w:spacing w:line="240" w:lineRule="auto"/>
-              <w:rPr>
-                <w:rFonts w:ascii="Times New Roman" w:eastAsia="Times New Roman" w:hAnsi="Times New Roman" w:cs="Times New Roman"/>
-              </w:rPr>
-            </w:pPr>
-            <w:r>
-              <w:rPr>
-                <w:rFonts w:ascii="Times New Roman" w:eastAsia="Times New Roman" w:hAnsi="Times New Roman" w:cs="Times New Roman"/>
-                <w:sz w:val="24"/>
-                <w:szCs w:val="24"/>
-                <w:lang w:val="en-IN" w:eastAsia="en-IN"/>
-              </w:rPr>
-              <w:t>GST @ 13.8%</w:t>
-            </w:r>
-          </w:p>
-        </w:tc>
-        <w:tc>
-          <w:tcPr>
-            <w:tcW w:w="3120" w:type="dxa"/>
-            <w:tcBorders>
-              <w:top w:val="single" w:sz="8" w:space="0" w:color="000000"/>
-              <w:left w:val="single" w:sz="8" w:space="0" w:color="000000"/>
-              <w:bottom w:val="single" w:sz="8" w:space="0" w:color="000000"/>
-              <w:right w:val="single" w:sz="8" w:space="0" w:color="000000"/>
-            </w:tcBorders>
-            <w:shd w:val="clear" w:color="auto" w:fill="auto"/>
-          </w:tcPr>
-          <w:p>
-            <w:pPr>
-              <w:pStyle w:val="normal1"/>
-              <w:widowControl w:val="0"/>
-              <w:spacing w:line="240" w:lineRule="auto"/>
-              <w:rPr>
-                <w:rFonts w:ascii="Times New Roman" w:eastAsia="Times New Roman" w:hAnsi="Times New Roman" w:cs="Times New Roman"/>
-                <w:b/>
-                <w:sz w:val="28"/>
-                <w:szCs w:val="28"/>
-              </w:rPr>
-            </w:pPr>
-            <w:r>
-              <w:rPr>
-                <w:rFonts w:ascii="Courier New" w:eastAsia="Times New Roman" w:hAnsi="Courier New" w:cs="Courier New"/>
-                <w:b/>
-                <w:bCs/>
-                <w:sz w:val="28"/>
-                <w:szCs w:val="28"/>
-                <w:lang w:val="en-IN" w:eastAsia="en-IN"/>
-              </w:rPr>
-              <w:t>₹</w:t>
-            </w:r>
-            <w:r>
-              <w:rPr>
-                <w:rFonts w:ascii="Courier New" w:eastAsia="Times New Roman" w:hAnsi="Courier New" w:cs="Courier New"/>
-                <w:b/>
-                <w:bCs/>
-                <w:sz w:val="28"/>
-                <w:szCs w:val="28"/>
-                <w:lang w:val="en-IN" w:eastAsia="en-IN"/>
-              </w:rPr>
-              <w:t>{</w:t>
-            </w:r>
-            <w:proofErr w:type="spellStart"/>
-            <w:r>
-              <w:rPr>
-                <w:rFonts w:ascii="Courier New" w:eastAsia="Times New Roman" w:hAnsi="Courier New" w:cs="Courier New"/>
-                <w:b/>
-                <w:bCs/>
-                <w:sz w:val="28"/>
-                <w:szCs w:val="28"/>
-                <w:lang w:val="en-IN" w:eastAsia="en-IN"/>
-              </w:rPr>
-              <w:t>gst_amount</w:t>
-            </w:r>
-            <w:proofErr w:type="spellEnd"/>
-            <w:r>
-              <w:rPr>
-                <w:rFonts w:ascii="Courier New" w:eastAsia="Times New Roman" w:hAnsi="Courier New" w:cs="Courier New"/>
-                <w:b/>
-                <w:bCs/>
-                <w:sz w:val="28"/>
-                <w:szCs w:val="28"/>
-                <w:lang w:val="en-IN" w:eastAsia="en-IN"/>
-              </w:rPr>
-              <w:t>}</w:t>
-            </w:r>
-          </w:p>
-        </w:tc>
-      </w:tr>
-      <w:tr>
-        <w:tc>
-          <w:tcPr>
-            <w:tcW w:w="1798" w:type="dxa"/>
-            <w:tcBorders>
-              <w:top w:val="single" w:sz="8" w:space="0" w:color="000000"/>
-              <w:left w:val="single" w:sz="8" w:space="0" w:color="000000"/>
-              <w:bottom w:val="single" w:sz="8" w:space="0" w:color="000000"/>
-              <w:right w:val="single" w:sz="8" w:space="0" w:color="000000"/>
-            </w:tcBorders>
-            <w:shd w:val="clear" w:color="auto" w:fill="auto"/>
-          </w:tcPr>
-          <w:p>
-            <w:pPr>
-              <w:pStyle w:val="normal1"/>
-              <w:widowControl w:val="0"/>
-              <w:spacing w:line="240" w:lineRule="auto"/>
-              <w:rPr>
-                <w:rFonts w:ascii="Times New Roman" w:eastAsia="Times New Roman" w:hAnsi="Times New Roman" w:cs="Times New Roman"/>
-              </w:rPr>
-            </w:pPr>
-            <w:r>
-              <w:rPr>
                 <w:rFonts w:ascii="Charis SIL" w:eastAsia="Times New Roman" w:hAnsi="Charis SIL" w:cs="Charis SIL"/>
               </w:rPr>
               <w:t>8</w:t>
@@ -3065,8 +3086,6 @@
           <w:lang w:eastAsia="en-IN" w:bidi="hi-IN"/>
         </w:rPr>
       </w:pPr>
-      <w:bookmarkStart w:id="0" w:name="_GoBack"/>
-      <w:bookmarkEnd w:id="0"/>
     </w:p>
     <w:p>
       <w:pPr>
@@ -5815,7 +5834,7 @@
 </file>
 
 <file path=customXml/itemProps1.xml><?xml version="1.0" encoding="utf-8"?>
-<ds:datastoreItem xmlns:ds="http://schemas.openxmlformats.org/officeDocument/2006/customXml" ds:itemID="{587AB28B-1455-484A-AE60-1A9EB7EF04FA}">
+<ds:datastoreItem xmlns:ds="http://schemas.openxmlformats.org/officeDocument/2006/customXml" ds:itemID="{2FECDBF5-B213-4071-BB71-5B2B7583B235}">
   <ds:schemaRefs>
     <ds:schemaRef ds:uri="http://schemas.openxmlformats.org/officeDocument/2006/bibliography"/>
   </ds:schemaRefs>

</xml_diff>